<commit_message>
paper: 결과 표 자동 생성기 make_tables.py — Table 1·2·2b·3·S1 을 md+tex 양쪽 생성
- per-slice CSV 단일 원천에서 통계(Δ median(IQR)·볼륨 클러스터 부트스트랩 95% CI·
  볼륨 단위 Wilcoxon) 계산까지 내장 — 범용 to_latex 로는 불가한 부분.
- 부트스트랩 seed·호출 순서 고정으로 초안 수치 정확 재현(자가검증 7항목 ALL PASS:
  0.9140 / 78.2% / CI [76.8,79.7] / 55.8% / 0.9145 등).
- .md 는 한국어(현행 초안 표기), .tex 는 booktabs+영문 헤더(영어 전환용 —
  MDPI 는 Word 허용이라 LaTeX 는 선택).
- 생성기가 초안 손계산 오류 1건 검출·정정: Table 2 NMSE std ±0.00530/±0.00527
  → 실계산 ±0.00525/±0.00526 (그 외 셀도 생성기 출력으로 정밀도 통일).
- 부록 A: Tab.1–3·S1 소스를 자동 생성 체계로 갱신. docx 재생성.

Co-Authored-By: Claude Fable 5 <noreply@anthropic.com>
Claude-Session: https://claude.ai/code/session_011nyjfZYkRdv28uLr5aszTX
</commit_message>
<xml_diff>
--- a/paper/draft_ko_v2.docx
+++ b/paper/draft_ko_v2.docx
@@ -3728,7 +3728,7 @@
               <w:pStyle w:val="Compact"/>
             </w:pPr>
             <w:r>
-              <w:t xml:space="preserve">NMSE</w:t>
+              <w:t xml:space="preserve">NMSE — Δ×10⁻⁵</w:t>
             </w:r>
           </w:p>
         </w:tc>
@@ -3740,7 +3740,7 @@
               <w:jc w:val="right"/>
             </w:pPr>
             <w:r>
-              <w:t xml:space="preserve">0.00449±0.00530</w:t>
+              <w:t xml:space="preserve">0.00449±0.00525</w:t>
             </w:r>
           </w:p>
         </w:tc>
@@ -3752,7 +3752,7 @@
               <w:jc w:val="right"/>
             </w:pPr>
             <w:r>
-              <w:t xml:space="preserve">0.00438±0.00527</w:t>
+              <w:t xml:space="preserve">0.00438±0.00526</w:t>
             </w:r>
           </w:p>
         </w:tc>
@@ -3764,7 +3764,7 @@
               <w:jc w:val="right"/>
             </w:pPr>
             <w:r>
-              <w:t xml:space="preserve">+8.9e-5 (−0.6e-5, +2.1e-4)</w:t>
+              <w:t xml:space="preserve">+8.9 (−0.6, +20.6)</w:t>
             </w:r>
           </w:p>
         </w:tc>
@@ -3863,7 +3863,7 @@
               <w:jc w:val="right"/>
             </w:pPr>
             <w:r>
-              <w:t xml:space="preserve">+0.12 (+0.005, +0.24)</w:t>
+              <w:t xml:space="preserve">+0.115 (+0.005, +0.237)</w:t>
             </w:r>
           </w:p>
         </w:tc>
@@ -7530,120 +7530,81 @@
               <w:pStyle w:val="Compact"/>
             </w:pPr>
             <w:r>
-              <w:t xml:space="preserve">Tab.1 best 지표 비교</w:t>
-            </w:r>
-          </w:p>
-        </w:tc>
-        <w:tc>
-          <w:tcPr/>
-          <w:p>
-            <w:pPr>
-              <w:pStyle w:val="Compact"/>
-            </w:pPr>
+              <w:t xml:space="preserve">Tab.1·2·2b·3·S1 (결과 표 일체)</w:t>
+            </w:r>
+          </w:p>
+        </w:tc>
+        <w:tc>
+          <w:tcPr/>
+          <w:p>
+            <w:pPr>
+              <w:pStyle w:val="Compact"/>
+            </w:pPr>
+            <w:r>
+              <w:rPr>
+                <w:b/>
+                <w:bCs/>
+              </w:rPr>
+              <w:t xml:space="preserve">자동 생성</w:t>
+            </w:r>
+            <w:r>
+              <w:t xml:space="preserve">:</w:t>
+            </w:r>
+            <w:r>
+              <w:t xml:space="preserve"> </w:t>
+            </w:r>
             <w:r>
               <w:rPr>
                 <w:rStyle w:val="VerbatimChar"/>
               </w:rPr>
-              <w:t xml:space="preserve">docs/v8_eter_pure_rnn_vs_ss2d.md</w:t>
+              <w:t xml:space="preserve">paper/make_tables.py</w:t>
             </w:r>
             <w:r>
               <w:t xml:space="preserve"> </w:t>
             </w:r>
             <w:r>
-              <w:t xml:space="preserve">§3</w:t>
-            </w:r>
-          </w:p>
-        </w:tc>
-        <w:tc>
-          <w:tcPr/>
-          <w:p>
-            <w:pPr>
-              <w:pStyle w:val="Compact"/>
-            </w:pPr>
-            <w:r>
-              <w:t xml:space="preserve">✅</w:t>
-            </w:r>
-          </w:p>
-        </w:tc>
-      </w:tr>
-      <w:tr>
-        <w:tc>
-          <w:tcPr/>
-          <w:p>
-            <w:pPr>
-              <w:pStyle w:val="Compact"/>
-            </w:pPr>
-            <w:r>
-              <w:t xml:space="preserve">Tab.2 per-slice win-rate</w:t>
-            </w:r>
-          </w:p>
-        </w:tc>
-        <w:tc>
-          <w:tcPr/>
-          <w:p>
-            <w:pPr>
-              <w:pStyle w:val="Compact"/>
-            </w:pPr>
+              <w:t xml:space="preserve">→</w:t>
+            </w:r>
+            <w:r>
+              <w:t xml:space="preserve"> </w:t>
+            </w:r>
             <w:r>
               <w:rPr>
                 <w:rStyle w:val="VerbatimChar"/>
               </w:rPr>
-              <w:t xml:space="preserve">results/eval/*/win_rate_summary*.md</w:t>
-            </w:r>
-          </w:p>
-        </w:tc>
-        <w:tc>
-          <w:tcPr/>
-          <w:p>
-            <w:pPr>
-              <w:pStyle w:val="Compact"/>
-            </w:pPr>
-            <w:r>
-              <w:t xml:space="preserve">✅</w:t>
-            </w:r>
-          </w:p>
-        </w:tc>
-      </w:tr>
-      <w:tr>
-        <w:tc>
-          <w:tcPr/>
-          <w:p>
-            <w:pPr>
-              <w:pStyle w:val="Compact"/>
-            </w:pPr>
-            <w:r>
-              <w:t xml:space="preserve">Tab.3 강화판 비교</w:t>
-            </w:r>
-          </w:p>
-        </w:tc>
-        <w:tc>
-          <w:tcPr/>
-          <w:p>
-            <w:pPr>
-              <w:pStyle w:val="Compact"/>
-            </w:pPr>
+              <w:t xml:space="preserve">paper/tables/*.{md,tex}</w:t>
+            </w:r>
+            <w:r>
+              <w:t xml:space="preserve"> </w:t>
+            </w:r>
+            <w:r>
+              <w:t xml:space="preserve">— per-slice CSV 단일 원천, median(IQR)·클러스터 부트스트랩 CI·볼륨 Wilcoxon 내장, seed 고정으로 초안 수치 자가검증(ALL PASS).</w:t>
+            </w:r>
+            <w:r>
+              <w:t xml:space="preserve"> </w:t>
+            </w:r>
             <w:r>
               <w:rPr>
                 <w:rStyle w:val="VerbatimChar"/>
               </w:rPr>
-              <w:t xml:space="preserve">docs/v9_mamba_unleashed_and_radapt.md</w:t>
+              <w:t xml:space="preserve">.tex</w:t>
             </w:r>
             <w:r>
               <w:t xml:space="preserve"> </w:t>
             </w:r>
             <w:r>
-              <w:t xml:space="preserve">§11.1</w:t>
-            </w:r>
-          </w:p>
-        </w:tc>
-        <w:tc>
-          <w:tcPr/>
-          <w:p>
-            <w:pPr>
-              <w:pStyle w:val="Compact"/>
-            </w:pPr>
-            <w:r>
-              <w:t xml:space="preserve">✅</w:t>
+              <w:t xml:space="preserve">는 영어 전환용(MDPI 는 Word 도 허용 — 선택 사용)</w:t>
+            </w:r>
+          </w:p>
+        </w:tc>
+        <w:tc>
+          <w:tcPr/>
+          <w:p>
+            <w:pPr>
+              <w:pStyle w:val="Compact"/>
+            </w:pPr>
+            <w:r>
+              <w:t xml:space="preserve">✅ 2026-08-20</w:t>
             </w:r>
           </w:p>
         </w:tc>

</xml_diff>

<commit_message>
paper: §3.2 정밀 교정 — GRU H 선택 명문화(canonical 880.5M 재현검증) + SS2D 스택 0.12M 실측 + 시드 서술 정정
- 교수님 canonical model.py(H=12) 직접 인스턴스화 880.5M = 우리 재현 클래스 H=12 와 완전 일치
  (파라미터 수준 재현 검증). v8 의 H=10(model3 config 원본값) 채택을 본문에 명시 — 21× 는
  canonical 28× 의 하한(보수적 선택).
- 'SSM 자체 ~1M' → 실측 0.12M 로 교정.
- '랜덤 시드 동일' 오기 제거 — 시드 비고정 사실 + 멀티시드 보완 참조로 교정.

Co-Authored-By: Claude Opus 5 (1M context) <noreply@anthropic.com>
Claude-Session: https://claude.ai/code/session_01K9R7kHFdEypGNVHFR6Uhbz
</commit_message>
<xml_diff>
--- a/paper/draft_ko_v2.docx
+++ b/paper/draft_ko_v2.docx
@@ -1938,13 +1938,62 @@
         <w:t xml:space="preserve">GRU arm</w:t>
       </w:r>
       <w:r>
-        <w:t xml:space="preserve">: ETER-Net 원본 [1]의 양방향(수평+수직) GRU. 행/열 flatten-reshape 구조로 총</w:t>
-      </w:r>
-      <w:r>
-        <w:t xml:space="preserve"> </w:t>
-      </w:r>
-      <w:r>
-        <w:t xml:space="preserve">668M 파라미터.</w:t>
+        <w:t xml:space="preserve">: ETER-Net 원본 [1]의 양방향(수평+수직) GRU, 행/열 flatten-reshape 구조. hidden</w:t>
+      </w:r>
+      <w:r>
+        <w:t xml:space="preserve"> </w:t>
+      </w:r>
+      <w:r>
+        <w:t xml:space="preserve">배수는 원 코드의 두 설정(canonical</w:t>
+      </w:r>
+      <w:r>
+        <w:t xml:space="preserve"> </w:t>
+      </w:r>
+      <w:r>
+        <w:rPr>
+          <w:rStyle w:val="VerbatimChar"/>
+        </w:rPr>
+        <w:t xml:space="preserve">model.py</w:t>
+      </w:r>
+      <w:r>
+        <w:t xml:space="preserve"> </w:t>
+      </w:r>
+      <w:r>
+        <w:t xml:space="preserve">H=12 / model3 config H=10) 중</w:t>
+      </w:r>
+      <w:r>
+        <w:t xml:space="preserve"> </w:t>
+      </w:r>
+      <w:r>
+        <w:rPr>
+          <w:b/>
+          <w:bCs/>
+        </w:rPr>
+        <w:t xml:space="preserve">10</w:t>
+      </w:r>
+      <w:r>
+        <w:t xml:space="preserve"> </w:t>
+      </w:r>
+      <w:r>
+        <w:t xml:space="preserve">을 채택해</w:t>
+      </w:r>
+      <w:r>
+        <w:t xml:space="preserve"> </w:t>
+      </w:r>
+      <w:r>
+        <w:t xml:space="preserve">총 668M. canonical H=12 로는 880.5M — 재현 클래스를 원본 클래스와 동일 세팅에서 파라미터</w:t>
+      </w:r>
+      <w:r>
+        <w:t xml:space="preserve"> </w:t>
+      </w:r>
+      <w:r>
+        <w:t xml:space="preserve">완전 일치로 검증했다(2026-09-02). 즉 H=10 채택은 GRU 를 더 작게 잡는 보수적 선택이며, 본문의</w:t>
+      </w:r>
+      <w:r>
+        <w:t xml:space="preserve"> </w:t>
+      </w:r>
+      <w:r>
+        <w:t xml:space="preserve">파라미터 격차 21×는 canonical 기준(28×)의 하한이다.</w:t>
       </w:r>
     </w:p>
     <w:p>
@@ -1969,13 +2018,13 @@
         <w:t xml:space="preserve"> </w:t>
       </w:r>
       <w:r>
-        <w:t xml:space="preserve">동일한 20으로 강제 정합해 용량 상한을 GRU 이하로 억제 — 총 31M(이 중 공유 U-Net 이 ~30M 로</w:t>
-      </w:r>
-      <w:r>
-        <w:t xml:space="preserve"> </w:t>
-      </w:r>
-      <w:r>
-        <w:t xml:space="preserve">지배적이고, SSM 자체는 ~1M).</w:t>
+        <w:t xml:space="preserve">동일한 20으로 강제 정합해 용량 상한을 GRU 이하로 억제 — 총 31.2M(이 중 공유 U-Net 이 31.1M 로</w:t>
+      </w:r>
+      <w:r>
+        <w:t xml:space="preserve"> </w:t>
+      </w:r>
+      <w:r>
+        <w:t xml:space="preserve">지배적이고, SSM 스택 자체는 실측 0.12M).</w:t>
       </w:r>
     </w:p>
     <w:p>
@@ -2006,7 +2055,13 @@
         <w:t xml:space="preserve"> </w:t>
       </w:r>
       <w:r>
-        <w:t xml:space="preserve">U-Net·랜덤 시드.</w:t>
+        <w:t xml:space="preserve">U-Net. (난수 시드는 두 런 모두 고정하지 않았다 — 시드 민감도는 멀티시드 재현 실험으로 별도</w:t>
+      </w:r>
+      <w:r>
+        <w:t xml:space="preserve"> </w:t>
+      </w:r>
+      <w:r>
+        <w:t xml:space="preserve">검증한다, §5-(6).)</w:t>
       </w:r>
     </w:p>
     <w:bookmarkEnd w:id="17"/>

</xml_diff>

<commit_message>
paper: 부록 B-8 신설 — GRU hidden 배수(10 vs 12) 교수님 상의 항목 (canonical 880.5M 검증 근거 포함)
Co-Authored-By: Claude Opus 5 (1M context) <noreply@anthropic.com>
Claude-Session: https://claude.ai/code/session_01K9R7kHFdEypGNVHFR6Uhbz
</commit_message>
<xml_diff>
--- a/paper/draft_ko_v2.docx
+++ b/paper/draft_ko_v2.docx
@@ -9191,6 +9191,113 @@
       </w:r>
       <w:r>
         <w:t xml:space="preserve">: 공학 저널(Sensors/Bioengineering) 전제면 현행 전략 유지.</w:t>
+      </w:r>
+    </w:p>
+    <w:p>
+      <w:pPr>
+        <w:numPr>
+          <w:ilvl w:val="0"/>
+          <w:numId w:val="1009"/>
+        </w:numPr>
+      </w:pPr>
+      <w:r>
+        <w:rPr>
+          <w:b/>
+          <w:bCs/>
+        </w:rPr>
+        <w:t xml:space="preserve">(09-02 신규) GRU hidden 배수 선택 — 10 vs 12</w:t>
+      </w:r>
+      <w:r>
+        <w:t xml:space="preserve"> </w:t>
+      </w:r>
+      <w:r>
+        <w:t xml:space="preserve">— 교수님 코드의 두 설정이 다름:</w:t>
+      </w:r>
+      <w:r>
+        <w:t xml:space="preserve"> </w:t>
+      </w:r>
+      <w:r>
+        <w:t xml:space="preserve">canonical</w:t>
+      </w:r>
+      <w:r>
+        <w:t xml:space="preserve"> </w:t>
+      </w:r>
+      <w:r>
+        <w:rPr>
+          <w:rStyle w:val="VerbatimChar"/>
+        </w:rPr>
+        <w:t xml:space="preserve">model.py</w:t>
+      </w:r>
+      <w:r>
+        <w:t xml:space="preserve"> </w:t>
+      </w:r>
+      <w:r>
+        <w:t xml:space="preserve">=</w:t>
+      </w:r>
+      <w:r>
+        <w:t xml:space="preserve"> </w:t>
+      </w:r>
+      <w:r>
+        <w:rPr>
+          <w:b/>
+          <w:bCs/>
+        </w:rPr>
+        <w:t xml:space="preserve">12</w:t>
+      </w:r>
+      <w:r>
+        <w:t xml:space="preserve">(총 880.5M) / model3 config =</w:t>
+      </w:r>
+      <w:r>
+        <w:t xml:space="preserve"> </w:t>
+      </w:r>
+      <w:r>
+        <w:rPr>
+          <w:b/>
+          <w:bCs/>
+        </w:rPr>
+        <w:t xml:space="preserve">10</w:t>
+      </w:r>
+      <w:r>
+        <w:t xml:space="preserve">(총 668.2M, v8 채택·config</w:t>
+      </w:r>
+      <w:r>
+        <w:t xml:space="preserve"> </w:t>
+      </w:r>
+      <w:r>
+        <w:t xml:space="preserve">주석에 문서화). 재현 클래스는 H=12 세팅에서 원본 클래스와 파라미터 완전 일치 검증(09-02).</w:t>
+      </w:r>
+      <w:r>
+        <w:t xml:space="preserve"> </w:t>
+      </w:r>
+      <w:r>
+        <w:t xml:space="preserve">확인 요청: ① 어느 값을</w:t>
+      </w:r>
+      <w:r>
+        <w:t xml:space="preserve"> </w:t>
+      </w:r>
+      <w:r>
+        <w:t xml:space="preserve">“원본”</w:t>
+      </w:r>
+      <w:r>
+        <w:t xml:space="preserve">으로 인용할지(§3.2 는 현재 양쪽을 병기하고 10 채택을 명시),</w:t>
+      </w:r>
+      <w:r>
+        <w:t xml:space="preserve"> </w:t>
+      </w:r>
+      <w:r>
+        <w:t xml:space="preserve">② canonical 충실성이 중요하면 H=12 검증 런(≈6일, VRAM 확인 필요) 추가 여부. 참고: H=10</w:t>
+      </w:r>
+      <w:r>
+        <w:t xml:space="preserve"> </w:t>
+      </w:r>
+      <w:r>
+        <w:t xml:space="preserve">채택은 GRU 를 작게 잡는 보수적 방향이라 파라미터 격차 21×는 canonical 기준(28×)의 하한 —</w:t>
+      </w:r>
+      <w:r>
+        <w:t xml:space="preserve"> </w:t>
+      </w:r>
+      <w:r>
+        <w:t xml:space="preserve">비교의 유불리 문제는 아님.</w:t>
       </w:r>
     </w:p>
     <w:bookmarkEnd w:id="36"/>

</xml_diff>